<commit_message>
Update Lab 1 Report document
</commit_message>
<xml_diff>
--- a/labs/lab1/Lab 1 Report.docx
+++ b/labs/lab1/Lab 1 Report.docx
@@ -75,7 +75,7 @@
       <w:pPr>
         <w:spacing w:before="100" w:beforeAutospacing="1" w:after="100" w:afterAutospacing="1" w:line="240" w:lineRule="auto"/>
         <w:rPr>
-          <w:rFonts w:ascii="Times New Roman" w:eastAsia="Times New Roman" w:hAnsi="Times New Roman" w:cs="Times New Roman" w:hint="eastAsia"/>
+          <w:rFonts w:ascii="Times New Roman" w:eastAsia="Times New Roman" w:hAnsi="Times New Roman" w:cs="Times New Roman"/>
           <w:kern w:val="0"/>
           <w14:ligatures w14:val="none"/>
         </w:rPr>
@@ -196,7 +196,25 @@
           <w:kern w:val="0"/>
           <w14:ligatures w14:val="none"/>
         </w:rPr>
-        <w:t xml:space="preserve"> I have successfully set up the SEED Ubuntu 20.04 virtual machine on AWS cloud and connected to it via VNC Viewer.</w:t>
+        <w:t xml:space="preserve"> </w:t>
+      </w:r>
+    </w:p>
+    <w:p>
+      <w:pPr>
+        <w:spacing w:before="100" w:beforeAutospacing="1" w:after="100" w:afterAutospacing="1" w:line="240" w:lineRule="auto"/>
+        <w:rPr>
+          <w:rFonts w:ascii="Times New Roman" w:eastAsia="Times New Roman" w:hAnsi="Times New Roman" w:cs="Times New Roman"/>
+          <w:kern w:val="0"/>
+          <w14:ligatures w14:val="none"/>
+        </w:rPr>
+      </w:pPr>
+      <w:r>
+        <w:rPr>
+          <w:rFonts w:ascii="Times New Roman" w:eastAsia="Times New Roman" w:hAnsi="Times New Roman" w:cs="Times New Roman"/>
+          <w:kern w:val="0"/>
+          <w14:ligatures w14:val="none"/>
+        </w:rPr>
+        <w:t>I have successfully set up the SEED Ubuntu 20.04 virtual machine on AWS cloud and connected to it via VNC Viewer.</w:t>
       </w:r>
     </w:p>
     <w:p>
@@ -239,6 +257,7 @@
       <w:r>
         <w:rPr>
           <w:rFonts w:ascii="Times New Roman" w:eastAsia="Times New Roman" w:hAnsi="Times New Roman" w:cs="Times New Roman"/>
+          <w:noProof/>
           <w:kern w:val="0"/>
           <w14:ligatures w14:val="none"/>
         </w:rPr>
@@ -378,7 +397,7 @@
       <w:pPr>
         <w:spacing w:before="100" w:beforeAutospacing="1" w:after="100" w:afterAutospacing="1" w:line="240" w:lineRule="auto"/>
         <w:rPr>
-          <w:rFonts w:ascii="Times New Roman" w:eastAsia="Times New Roman" w:hAnsi="Times New Roman" w:cs="Times New Roman" w:hint="eastAsia"/>
+          <w:rFonts w:ascii="Times New Roman" w:eastAsia="Times New Roman" w:hAnsi="Times New Roman" w:cs="Times New Roman"/>
           <w:kern w:val="0"/>
           <w14:ligatures w14:val="none"/>
         </w:rPr>
@@ -603,7 +622,7 @@
       <w:pPr>
         <w:spacing w:before="100" w:beforeAutospacing="1" w:after="100" w:afterAutospacing="1" w:line="240" w:lineRule="auto"/>
         <w:rPr>
-          <w:rFonts w:ascii="Times New Roman" w:eastAsia="Times New Roman" w:hAnsi="Times New Roman" w:cs="Times New Roman" w:hint="eastAsia"/>
+          <w:rFonts w:ascii="Times New Roman" w:eastAsia="Times New Roman" w:hAnsi="Times New Roman" w:cs="Times New Roman"/>
           <w:kern w:val="0"/>
           <w14:ligatures w14:val="none"/>
         </w:rPr>
@@ -615,7 +634,7 @@
           <w:kern w:val="0"/>
         </w:rPr>
         <w:drawing>
-          <wp:inline distT="0" distB="0" distL="0" distR="0" wp14:anchorId="5A989E76" wp14:editId="3E1F1ECA">
+          <wp:inline distT="0" distB="0" distL="0" distR="0" wp14:anchorId="5A989E76" wp14:editId="72F33734">
             <wp:extent cx="5943600" cy="3808095"/>
             <wp:effectExtent l="0" t="0" r="0" b="1905"/>
             <wp:docPr id="1818645818" name="Picture 3" descr="A screenshot of a computer&#10;&#10;Description automatically generated"/>
@@ -837,7 +856,7 @@
       <w:pPr>
         <w:spacing w:before="100" w:beforeAutospacing="1" w:after="100" w:afterAutospacing="1" w:line="240" w:lineRule="auto"/>
         <w:rPr>
-          <w:rFonts w:ascii="Times New Roman" w:eastAsia="Times New Roman" w:hAnsi="Times New Roman" w:cs="Times New Roman" w:hint="eastAsia"/>
+          <w:rFonts w:ascii="Times New Roman" w:eastAsia="Times New Roman" w:hAnsi="Times New Roman" w:cs="Times New Roman"/>
           <w:kern w:val="0"/>
           <w14:ligatures w14:val="none"/>
         </w:rPr>
@@ -1093,7 +1112,7 @@
       <w:pPr>
         <w:spacing w:before="100" w:beforeAutospacing="1" w:after="100" w:afterAutospacing="1" w:line="240" w:lineRule="auto"/>
         <w:rPr>
-          <w:rFonts w:ascii="Times New Roman" w:eastAsia="Times New Roman" w:hAnsi="Times New Roman" w:cs="Times New Roman" w:hint="eastAsia"/>
+          <w:rFonts w:ascii="Times New Roman" w:eastAsia="Times New Roman" w:hAnsi="Times New Roman" w:cs="Times New Roman"/>
           <w:kern w:val="0"/>
           <w14:ligatures w14:val="none"/>
         </w:rPr>
@@ -1443,7 +1462,7 @@
       <w:pPr>
         <w:spacing w:before="100" w:beforeAutospacing="1" w:after="100" w:afterAutospacing="1" w:line="240" w:lineRule="auto"/>
         <w:rPr>
-          <w:rFonts w:ascii="Times New Roman" w:eastAsia="Times New Roman" w:hAnsi="Times New Roman" w:cs="Times New Roman" w:hint="eastAsia"/>
+          <w:rFonts w:ascii="Times New Roman" w:eastAsia="Times New Roman" w:hAnsi="Times New Roman" w:cs="Times New Roman"/>
           <w:kern w:val="0"/>
           <w14:ligatures w14:val="none"/>
         </w:rPr>
@@ -1654,7 +1673,7 @@
       <w:pPr>
         <w:spacing w:before="100" w:beforeAutospacing="1" w:after="100" w:afterAutospacing="1" w:line="240" w:lineRule="auto"/>
         <w:rPr>
-          <w:rFonts w:ascii="Times New Roman" w:eastAsia="Times New Roman" w:hAnsi="Times New Roman" w:cs="Times New Roman" w:hint="eastAsia"/>
+          <w:rFonts w:ascii="Times New Roman" w:eastAsia="Times New Roman" w:hAnsi="Times New Roman" w:cs="Times New Roman"/>
           <w:kern w:val="0"/>
           <w14:ligatures w14:val="none"/>
         </w:rPr>

</xml_diff>